<commit_message>
docs(sorting): say how to get a shell inside the container
The manual-run block of the report (EN/FR, HTML + Word), RUNNING.md and
the 04/10 restart block in SESSION_RESUME went from `docker start` straight
to commands that only work inside the container. `docker start` only
starts it in the background; `docker exec -it gazebo_to_lerobot bash`
opens the shell, whose ~/.bashrc already loads ROS 2 and the workspace.
Each step now says whether it runs on the WSL2 host or in the container,
and the host-side `docker exec -d` batch command is no longer listed
under the container. RUNNING.md section 1 also changes into
/workspace/htgspp before running preflight.sh.
</commit_message>
<xml_diff>
--- a/Headless_Task-Grounded_Pick-and-Sort-and-Place_in_Gazebo/doc/FOUR_OBJECT_SORTING_REPORT.docx
+++ b/Headless_Task-Grounded_Pick-and-Sort-and-Place_in_Gazebo/doc/FOUR_OBJECT_SORTING_REPORT.docx
@@ -13151,6 +13151,64 @@
     </w:p>
     <w:p>
       <w:pPr>
+        <w:spacing w:after="100"/>
+      </w:pPr>
+      <w:r>
+        <w:t xml:space="preserve">Commands run in two places: the </w:t>
+      </w:r>
+      <w:r>
+        <w:rPr>
+          <w:b/>
+          <w:bCs/>
+        </w:rPr>
+        <w:t xml:space="preserve">WSL2 host</w:t>
+      </w:r>
+      <w:r>
+        <w:t xml:space="preserve"> (your Ubuntu prompt) and a </w:t>
+      </w:r>
+      <w:r>
+        <w:rPr>
+          <w:b/>
+          <w:bCs/>
+        </w:rPr>
+        <w:t xml:space="preserve">shell inside the container</w:t>
+      </w:r>
+      <w:r>
+        <w:t xml:space="preserve">. </w:t>
+      </w:r>
+      <w:r>
+        <w:rPr>
+          <w:rFonts w:ascii="Consolas" w:cs="Consolas" w:eastAsia="Consolas" w:hAnsi="Consolas"/>
+          <w:color w:val="0E4A40"/>
+        </w:rPr>
+        <w:t xml:space="preserve">docker start</w:t>
+      </w:r>
+      <w:r>
+        <w:t xml:space="preserve"> only starts the container in the background; </w:t>
+      </w:r>
+      <w:r>
+        <w:rPr>
+          <w:rFonts w:ascii="Consolas" w:cs="Consolas" w:eastAsia="Consolas" w:hAnsi="Consolas"/>
+          <w:color w:val="0E4A40"/>
+        </w:rPr>
+        <w:t xml:space="preserve">docker exec -it gazebo_to_lerobot bash</w:t>
+      </w:r>
+      <w:r>
+        <w:t xml:space="preserve"> opens the shell inside it, whose </w:t>
+      </w:r>
+      <w:r>
+        <w:rPr>
+          <w:rFonts w:ascii="Consolas" w:cs="Consolas" w:eastAsia="Consolas" w:hAnsi="Consolas"/>
+          <w:color w:val="0E4A40"/>
+        </w:rPr>
+        <w:t xml:space="preserve">~/.bashrc</w:t>
+      </w:r>
+      <w:r>
+        <w:t xml:space="preserve"> loads ROS 2 and the workspace.</w:t>
+      </w:r>
+    </w:p>
+    <w:p>
+      <w:pPr>
         <w:shd w:fill="10201D" w:val="clear"/>
         <w:spacing w:after="0"/>
       </w:pPr>
@@ -13161,7 +13219,7 @@
           <w:sz w:val="17"/>
           <w:szCs w:val="17"/>
         </w:rPr>
-        <w:t xml:space="preserve"># host (WSL2): Docker has no systemd here</w:t>
+        <w:t xml:space="preserve"># 1. WSL2 host: start Docker (no systemd in WSL) and the container</w:t>
       </w:r>
     </w:p>
     <w:p>
@@ -13191,7 +13249,7 @@
           <w:sz w:val="17"/>
           <w:szCs w:val="17"/>
         </w:rPr>
-        <w:t xml:space="preserve">docker start gazebo_to_lerobot</w:t>
+        <w:t xml:space="preserve">docker start gazebo_to_lerobot          # runs in the background, gives no shell</w:t>
       </w:r>
     </w:p>
     <w:p>
@@ -13221,7 +13279,7 @@
           <w:sz w:val="17"/>
           <w:szCs w:val="17"/>
         </w:rPr>
-        <w:t xml:space="preserve"># container</w:t>
+        <w:t xml:space="preserve"># 2. WSL2 host: open a shell inside the container</w:t>
       </w:r>
     </w:p>
     <w:p>
@@ -13236,7 +13294,7 @@
           <w:sz w:val="17"/>
           <w:szCs w:val="17"/>
         </w:rPr>
-        <w:t xml:space="preserve">cd /workspace/htgspp &amp;&amp; bash preflight.sh            # PREFLIGHT PASSED</w:t>
+        <w:t xml:space="preserve">docker exec -it gazebo_to_lerobot bash  # prompt becomes root@&lt;container id&gt;</w:t>
       </w:r>
     </w:p>
     <w:p>
@@ -13251,7 +13309,22 @@
           <w:sz w:val="17"/>
           <w:szCs w:val="17"/>
         </w:rPr>
-        <w:t xml:space="preserve">docker exec -d -w /workspace/htgspp -e CONTAINER_NAME=gazebo_to_lerobot gazebo_to_lerobot \</w:t>
+        <w:t xml:space="preserve"> </w:t>
+      </w:r>
+    </w:p>
+    <w:p>
+      <w:pPr>
+        <w:shd w:fill="10201D" w:val="clear"/>
+        <w:spacing w:after="0"/>
+      </w:pPr>
+      <w:r>
+        <w:rPr>
+          <w:rFonts w:ascii="Consolas" w:cs="Consolas" w:eastAsia="Consolas" w:hAnsi="Consolas"/>
+          <w:color w:val="7C978F"/>
+          <w:sz w:val="17"/>
+          <w:szCs w:val="17"/>
+        </w:rPr>
+        <w:t xml:space="preserve"># 3. container shell</w:t>
       </w:r>
     </w:p>
     <w:p>
@@ -13266,7 +13339,7 @@
           <w:sz w:val="17"/>
           <w:szCs w:val="17"/>
         </w:rPr>
-        <w:t xml:space="preserve">    bash -c 'bash scripts/batch.sh 1 60 &gt;&gt; batch.log 2&gt;&amp;1'     # ~2.7 h</w:t>
+        <w:t xml:space="preserve">cd /workspace/htgspp &amp;&amp; bash preflight.sh            # PREFLIGHT PASSED</w:t>
       </w:r>
     </w:p>
     <w:p>
@@ -13281,7 +13354,7 @@
           <w:sz w:val="17"/>
           <w:szCs w:val="17"/>
         </w:rPr>
-        <w:t xml:space="preserve">python3 scripts/port_bag.py --split train   --out datasets/mycobot_sorting_train</w:t>
+        <w:t xml:space="preserve">exit                                                 # back to the host</w:t>
       </w:r>
     </w:p>
     <w:p>
@@ -13296,7 +13369,22 @@
           <w:sz w:val="17"/>
           <w:szCs w:val="17"/>
         </w:rPr>
-        <w:t xml:space="preserve">python3 scripts/port_bag.py --split heldout --out datasets/mycobot_sorting_heldout</w:t>
+        <w:t xml:space="preserve"> </w:t>
+      </w:r>
+    </w:p>
+    <w:p>
+      <w:pPr>
+        <w:shd w:fill="10201D" w:val="clear"/>
+        <w:spacing w:after="0"/>
+      </w:pPr>
+      <w:r>
+        <w:rPr>
+          <w:rFonts w:ascii="Consolas" w:cs="Consolas" w:eastAsia="Consolas" w:hAnsi="Consolas"/>
+          <w:color w:val="7C978F"/>
+          <w:sz w:val="17"/>
+          <w:szCs w:val="17"/>
+        </w:rPr>
+        <w:t xml:space="preserve"># 4. WSL2 host: the batch, detached so closing the terminal does not stop it (~2.7 h)</w:t>
       </w:r>
     </w:p>
     <w:p>
@@ -13311,6 +13399,36 @@
           <w:sz w:val="17"/>
           <w:szCs w:val="17"/>
         </w:rPr>
+        <w:t xml:space="preserve">docker exec -d -w /workspace/htgspp -e CONTAINER_NAME=gazebo_to_lerobot gazebo_to_lerobot \</w:t>
+      </w:r>
+    </w:p>
+    <w:p>
+      <w:pPr>
+        <w:shd w:fill="10201D" w:val="clear"/>
+        <w:spacing w:after="0"/>
+      </w:pPr>
+      <w:r>
+        <w:rPr>
+          <w:rFonts w:ascii="Consolas" w:cs="Consolas" w:eastAsia="Consolas" w:hAnsi="Consolas"/>
+          <w:color w:val="D9EDE8"/>
+          <w:sz w:val="17"/>
+          <w:szCs w:val="17"/>
+        </w:rPr>
+        <w:t xml:space="preserve">    bash -c 'bash scripts/batch.sh 1 60 &gt;&gt; batch.log 2&gt;&amp;1'</w:t>
+      </w:r>
+    </w:p>
+    <w:p>
+      <w:pPr>
+        <w:shd w:fill="10201D" w:val="clear"/>
+        <w:spacing w:after="0"/>
+      </w:pPr>
+      <w:r>
+        <w:rPr>
+          <w:rFonts w:ascii="Consolas" w:cs="Consolas" w:eastAsia="Consolas" w:hAnsi="Consolas"/>
+          <w:color w:val="D9EDE8"/>
+          <w:sz w:val="17"/>
+          <w:szCs w:val="17"/>
+        </w:rPr>
         <w:t xml:space="preserve"> </w:t>
       </w:r>
     </w:p>
@@ -13326,13 +13444,13 @@
           <w:sz w:val="17"/>
           <w:szCs w:val="17"/>
         </w:rPr>
-        <w:t xml:space="preserve"># one episode, watch it or get a pass/fail code</w:t>
+        <w:t xml:space="preserve"># 5. after the batch, in a container shell (step 2 again)</w:t>
       </w:r>
     </w:p>
     <w:p>
       <w:pPr>
         <w:shd w:fill="10201D" w:val="clear"/>
-        <w:spacing w:after="120"/>
+        <w:spacing w:after="0"/>
       </w:pPr>
       <w:r>
         <w:rPr>
@@ -13341,7 +13459,127 @@
           <w:sz w:val="17"/>
           <w:szCs w:val="17"/>
         </w:rPr>
-        <w:t xml:space="preserve">cd launch &amp;&amp; ros2 launch pick_and_sort_and_place_no_gui_demo.launch.py episode:=16; echo $?</w:t>
+        <w:t xml:space="preserve">cd /workspace/htgspp</w:t>
+      </w:r>
+    </w:p>
+    <w:p>
+      <w:pPr>
+        <w:shd w:fill="10201D" w:val="clear"/>
+        <w:spacing w:after="0"/>
+      </w:pPr>
+      <w:r>
+        <w:rPr>
+          <w:rFonts w:ascii="Consolas" w:cs="Consolas" w:eastAsia="Consolas" w:hAnsi="Consolas"/>
+          <w:color w:val="D9EDE8"/>
+          <w:sz w:val="17"/>
+          <w:szCs w:val="17"/>
+        </w:rPr>
+        <w:t xml:space="preserve">python3 scripts/port_bag.py --split train   --out datasets/mycobot_sorting_train</w:t>
+      </w:r>
+    </w:p>
+    <w:p>
+      <w:pPr>
+        <w:shd w:fill="10201D" w:val="clear"/>
+        <w:spacing w:after="0"/>
+      </w:pPr>
+      <w:r>
+        <w:rPr>
+          <w:rFonts w:ascii="Consolas" w:cs="Consolas" w:eastAsia="Consolas" w:hAnsi="Consolas"/>
+          <w:color w:val="D9EDE8"/>
+          <w:sz w:val="17"/>
+          <w:szCs w:val="17"/>
+        </w:rPr>
+        <w:t xml:space="preserve">python3 scripts/port_bag.py --split heldout --out datasets/mycobot_sorting_heldout</w:t>
+      </w:r>
+    </w:p>
+    <w:p>
+      <w:pPr>
+        <w:shd w:fill="10201D" w:val="clear"/>
+        <w:spacing w:after="0"/>
+      </w:pPr>
+      <w:r>
+        <w:rPr>
+          <w:rFonts w:ascii="Consolas" w:cs="Consolas" w:eastAsia="Consolas" w:hAnsi="Consolas"/>
+          <w:color w:val="D9EDE8"/>
+          <w:sz w:val="17"/>
+          <w:szCs w:val="17"/>
+        </w:rPr>
+        <w:t xml:space="preserve"> </w:t>
+      </w:r>
+    </w:p>
+    <w:p>
+      <w:pPr>
+        <w:shd w:fill="10201D" w:val="clear"/>
+        <w:spacing w:after="0"/>
+      </w:pPr>
+      <w:r>
+        <w:rPr>
+          <w:rFonts w:ascii="Consolas" w:cs="Consolas" w:eastAsia="Consolas" w:hAnsi="Consolas"/>
+          <w:color w:val="7C978F"/>
+          <w:sz w:val="17"/>
+          <w:szCs w:val="17"/>
+        </w:rPr>
+        <w:t xml:space="preserve"># one episode, watch it or get a pass/fail code (container shell)</w:t>
+      </w:r>
+    </w:p>
+    <w:p>
+      <w:pPr>
+        <w:shd w:fill="10201D" w:val="clear"/>
+        <w:spacing w:after="0"/>
+      </w:pPr>
+      <w:r>
+        <w:rPr>
+          <w:rFonts w:ascii="Consolas" w:cs="Consolas" w:eastAsia="Consolas" w:hAnsi="Consolas"/>
+          <w:color w:val="D9EDE8"/>
+          <w:sz w:val="17"/>
+          <w:szCs w:val="17"/>
+        </w:rPr>
+        <w:t xml:space="preserve">cd /workspace/htgspp/launch &amp;&amp; ros2 launch pick_and_sort_and_place_no_gui_demo.launch.py episode:=16; echo $?</w:t>
+      </w:r>
+    </w:p>
+    <w:p>
+      <w:pPr>
+        <w:shd w:fill="10201D" w:val="clear"/>
+        <w:spacing w:after="0"/>
+      </w:pPr>
+      <w:r>
+        <w:rPr>
+          <w:rFonts w:ascii="Consolas" w:cs="Consolas" w:eastAsia="Consolas" w:hAnsi="Consolas"/>
+          <w:color w:val="D9EDE8"/>
+          <w:sz w:val="17"/>
+          <w:szCs w:val="17"/>
+        </w:rPr>
+        <w:t xml:space="preserve"> </w:t>
+      </w:r>
+    </w:p>
+    <w:p>
+      <w:pPr>
+        <w:shd w:fill="10201D" w:val="clear"/>
+        <w:spacing w:after="0"/>
+      </w:pPr>
+      <w:r>
+        <w:rPr>
+          <w:rFonts w:ascii="Consolas" w:cs="Consolas" w:eastAsia="Consolas" w:hAnsi="Consolas"/>
+          <w:color w:val="7C978F"/>
+          <w:sz w:val="17"/>
+          <w:szCs w:val="17"/>
+        </w:rPr>
+        <w:t xml:space="preserve"># or the GUI demo straight from the WSL2 host, no shell needed</w:t>
+      </w:r>
+    </w:p>
+    <w:p>
+      <w:pPr>
+        <w:shd w:fill="10201D" w:val="clear"/>
+        <w:spacing w:after="120"/>
+      </w:pPr>
+      <w:r>
+        <w:rPr>
+          <w:rFonts w:ascii="Consolas" w:cs="Consolas" w:eastAsia="Consolas" w:hAnsi="Consolas"/>
+          <w:color w:val="D9EDE8"/>
+          <w:sz w:val="17"/>
+          <w:szCs w:val="17"/>
+        </w:rPr>
+        <w:t xml:space="preserve">docker exec -it gazebo_to_lerobot /workspace/htgspp/scripts/run_gui_demo.sh episode:=16</w:t>
       </w:r>
     </w:p>
     <w:p>

</xml_diff>

<commit_message>
docs(sorting): report section 28 on the LeRobot v3.0 datasets
FOUR_OBJECT_SORTING_REPORT (EN/FR, HTML + Word), rebuilt from the
September originals with the addendum now running to section 28:
the first, hand-written conversion and its four defects; the action
definition the bags imposed (action[t] = state[t+1]); the rewrite on
LeRobot's own writer; checks a-f; the SmolVLA CPU smoke-train; the
provisional lerobot 0.4.4 pin. Section 26, the Part 10 status row, the
limits, the manual run, the bug table and the file list now give the
current datasets (29,687 / 7,411 frames, loaded by LeRobotDataset).
The role-split rewrites and the container-shell steps are re-applied.

Specification Appendix C points to addendum section 16-28;
SESSION_RESUME gains the 05/10 entry; CHANGELOG notes the doc work.
</commit_message>
<xml_diff>
--- a/Headless_Task-Grounded_Pick-and-Sort-and-Place_in_Gazebo/doc/FOUR_OBJECT_SORTING_REPORT.docx
+++ b/Headless_Task-Grounded_Pick-and-Sort-and-Place_in_Gazebo/doc/FOUR_OBJECT_SORTING_REPORT.docx
@@ -208,7 +208,7 @@
           <w:sz w:val="18"/>
           <w:szCs w:val="18"/>
         </w:rPr>
-        <w:t xml:space="preserve">Updated 2026-10-04: finished on one WSL2 laptop, 60/60 batch, two datasets, two launch files (addendum §16–27)</w:t>
+        <w:t xml:space="preserve">Updated 2026-10-05: finished on one WSL2 laptop, 60/60 batch, two datasets in LeRobot v3.0, two launch files (addendum §16–28)</w:t>
       </w:r>
     </w:p>
     <w:p>
@@ -242,10 +242,10 @@
           <w:b/>
           <w:bCs/>
         </w:rPr>
-        <w:t xml:space="preserve">Update, 2026-10-04 (addendum §16–27).</w:t>
-      </w:r>
-      <w:r>
-        <w:t xml:space="preserve"> The ceiling this report ends on was lifted. On 2–4 October the whole pipeline ran on a single WSL2 laptop with 7.8 GB visible to WSL (the September VM had ~3.8 GB): the recorder hang did not occur, every smoke episode completed, a 60-episode batch under one code version passed </w:t>
+        <w:t xml:space="preserve">Update, 2026-10-05 (addendum §16–28).</w:t>
+      </w:r>
+      <w:r>
+        <w:t xml:space="preserve"> The ceiling this report ends on was lifted. On 2–5 October the whole pipeline ran on a single WSL2 laptop with 7.8 GB visible to WSL (the September VM had ~3.8 GB): the recorder hang did not occur, every smoke episode completed, a 60-episode batch under one code version passed </w:t>
       </w:r>
       <w:r>
         <w:rPr>
@@ -255,7 +255,17 @@
         <w:t xml:space="preserve">60/60 on the first attempt</w:t>
       </w:r>
       <w:r>
-        <w:t xml:space="preserve">, both datasets were converted (</w:t>
+        <w:t xml:space="preserve">, both datasets were converted to LeRobot v3.0 and load with the real </w:t>
+      </w:r>
+      <w:r>
+        <w:rPr>
+          <w:rFonts w:ascii="Consolas" w:cs="Consolas" w:eastAsia="Consolas" w:hAnsi="Consolas"/>
+          <w:color w:val="0E4A40"/>
+        </w:rPr>
+        <w:t xml:space="preserve">LeRobotDataset</w:t>
+      </w:r>
+      <w:r>
+        <w:t xml:space="preserve"> (</w:t>
       </w:r>
       <w:r>
         <w:rPr>
@@ -275,7 +285,7 @@
         <w:t xml:space="preserve">mycobot_sorting_heldout</w:t>
       </w:r>
       <w:r>
-        <w:t xml:space="preserve"> 12), and two launch files run any episode with or without the Gazebo GUI. Getting there changed the scene: object start positions (lift J2 ≤ 48°), the bins (80 mm opening, blue bin moved 10 mm) and the release (boxes released square to their bin). The sections above are kept as written on 2026-09-23; the addendum says what changed and why, with every number measured on the laptop.</w:t>
+        <w:t xml:space="preserve"> 12; a SmolVLA CPU smoke-train ran on them), and two launch files run any episode with or without the Gazebo GUI. Getting there changed the scene: object start positions (lift J2 ≤ 48°), the bins (80 mm opening, blue bin moved 10 mm) and the release (boxes released square to their bin). The sections above are kept as written on 2026-09-23; the addendum says what changed and why, with every number measured on the laptop.</w:t>
       </w:r>
     </w:p>
     <w:p>
@@ -3065,7 +3075,7 @@
                 <w:sz w:val="19"/>
                 <w:szCs w:val="19"/>
               </w:rPr>
-              <w:t xml:space="preserve"> exercised on real data: </w:t>
+              <w:t xml:space="preserve"> rewritten on LeRobot's own writer: </w:t>
             </w:r>
             <w:r>
               <w:rPr>
@@ -3074,14 +3084,32 @@
                 <w:sz w:val="19"/>
                 <w:szCs w:val="19"/>
               </w:rPr>
-              <w:t xml:space="preserve">48 + 12 episodes converted</w:t>
-            </w:r>
-            <w:r>
-              <w:rPr>
-                <w:sz w:val="19"/>
-                <w:szCs w:val="19"/>
-              </w:rPr>
-              <w:t xml:space="preserve"> (§26).</w:t>
+              <w:t xml:space="preserve">48 + 12 episodes in LeRobot v3.0, loaded by </w:t>
+            </w:r>
+            <w:r>
+              <w:rPr>
+                <w:rFonts w:ascii="Consolas" w:cs="Consolas" w:eastAsia="Consolas" w:hAnsi="Consolas"/>
+                <w:b/>
+                <w:bCs/>
+                <w:color w:val="0E4A40"/>
+              </w:rPr>
+              <w:t xml:space="preserve">LeRobotDataset</w:t>
+            </w:r>
+            <w:r>
+              <w:rPr>
+                <w:b/>
+                <w:bCs/>
+                <w:sz w:val="19"/>
+                <w:szCs w:val="19"/>
+              </w:rPr>
+              <w:t xml:space="preserve"> under lerobot 0.4.4</w:t>
+            </w:r>
+            <w:r>
+              <w:rPr>
+                <w:sz w:val="19"/>
+                <w:szCs w:val="19"/>
+              </w:rPr>
+              <w:t xml:space="preserve"> (§28).</w:t>
             </w:r>
           </w:p>
         </w:tc>
@@ -3146,7 +3174,7 @@
                 <w:sz w:val="19"/>
                 <w:szCs w:val="19"/>
               </w:rPr>
-              <w:t xml:space="preserve">Everything ran on one laptop; the batch took ~2.7 h (§23, §26). Two launch files added (§27).</w:t>
+              <w:t xml:space="preserve">Everything ran on </w:t>
             </w:r>
             <w:r>
               <w:rPr>
@@ -3155,14 +3183,14 @@
                 <w:sz w:val="19"/>
                 <w:szCs w:val="19"/>
               </w:rPr>
-              <w:t xml:space="preserve"/>
-            </w:r>
-            <w:r>
-              <w:rPr>
-                <w:sz w:val="19"/>
-                <w:szCs w:val="19"/>
-              </w:rPr>
-              <w:t xml:space="preserve"/>
+              <w:t xml:space="preserve">one laptop</w:t>
+            </w:r>
+            <w:r>
+              <w:rPr>
+                <w:sz w:val="19"/>
+                <w:szCs w:val="19"/>
+              </w:rPr>
+              <w:t xml:space="preserve">; the batch took ~2.7 h (§23, §26). Two launch files added (§27).</w:t>
             </w:r>
           </w:p>
         </w:tc>
@@ -7471,7 +7499,7 @@
         <w:rPr>
           <w:color w:val="4B5B57"/>
         </w:rPr>
-        <w:t xml:space="preserve">Everything below happened on 2–4 October 2026 on one Windows laptop (Intel Core i7-11370H, 4 cores / 8 threads, 7.8 GB RAM and 2 GB swap visible in WSL2, Ubuntu 22.04.3, kernel 6.18.40.1-microsoft-standard-WSL2), in the </w:t>
+        <w:t xml:space="preserve">Everything below happened on 2–5 October 2026 on one Windows laptop (Intel Core i7-11370H, 4 cores / 8 threads, 7.8 GB RAM and 2 GB swap visible in WSL2, Ubuntu 22.04.3, kernel 6.18.40.1-microsoft-standard-WSL2), in the </w:t>
       </w:r>
       <w:r>
         <w:rPr>
@@ -11339,17 +11367,17 @@
         <w:t xml:space="preserve">distractors_moved</w:t>
       </w:r>
       <w:r>
-        <w:t xml:space="preserve"> into </w:t>
-      </w:r>
-      <w:r>
-        <w:rPr>
-          <w:rFonts w:ascii="Consolas" w:cs="Consolas" w:eastAsia="Consolas" w:hAnsi="Consolas"/>
-          <w:color w:val="0E4A40"/>
-        </w:rPr>
-        <w:t xml:space="preserve">meta/episodes.jsonl</w:t>
-      </w:r>
-      <w:r>
-        <w:t xml:space="preserve"> for every episode.</w:t>
+        <w:t xml:space="preserve"> for every episode, now into the sidecar </w:t>
+      </w:r>
+      <w:r>
+        <w:rPr>
+          <w:rFonts w:ascii="Consolas" w:cs="Consolas" w:eastAsia="Consolas" w:hAnsi="Consolas"/>
+          <w:color w:val="0E4A40"/>
+        </w:rPr>
+        <w:t xml:space="preserve">meta/episodes_extra.jsonl</w:t>
+      </w:r>
+      <w:r>
+        <w:t xml:space="preserve"> (§28).</w:t>
       </w:r>
     </w:p>
     <w:p>
@@ -11364,7 +11392,7 @@
         <w:t xml:space="preserve">Converted</w:t>
       </w:r>
       <w:r>
-        <w:t xml:space="preserve">: </w:t>
+        <w:t xml:space="preserve"> (final form in §28): </w:t>
       </w:r>
       <w:r>
         <w:rPr>
@@ -11374,7 +11402,7 @@
         <w:t xml:space="preserve">mycobot_sorting_train</w:t>
       </w:r>
       <w:r>
-        <w:t xml:space="preserve"> 48 episodes, 29 735 frames; </w:t>
+        <w:t xml:space="preserve"> 48 episodes, 29 687 frames; </w:t>
       </w:r>
       <w:r>
         <w:rPr>
@@ -11384,7 +11412,7 @@
         <w:t xml:space="preserve">mycobot_sorting_heldout</w:t>
       </w:r>
       <w:r>
-        <w:t xml:space="preserve"> 12 episodes, 7 423 frames; 320×240 at 30 fps; video frame counts match the parquet rows. Spec Part 13 metrics for the scripted demonstrator: task success 60/60, correct-bin 60/60, held-out success 12/12, placement offset median 0.031 of the inner radius (max 0.149), distractor disturbance 1/60, yield 60 clean episodes from 60 attempts.</w:t>
+        <w:t xml:space="preserve"> 12 episodes, 7 411 frames; 320×240 at 30 fps, LeRobot v3.0. Spec Part 13 metrics for the scripted demonstrator: task success 60/60, correct-bin 60/60, held-out success 12/12, placement offset median 0.031 of the inner radius (max 0.149), distractor disturbance 1/60, yield 60 clean episodes from 60 attempts.</w:t>
       </w:r>
     </w:p>
     <w:p>
@@ -11605,6 +11633,743 @@
       </w:r>
       <w:r>
         <w:t xml:space="preserve"> returned 0 whatever the demo returned (the headless launch now exits with the demo's own code).</w:t>
+      </w:r>
+    </w:p>
+    <w:p>
+      <w:pPr>
+        <w:pStyle w:val="Heading2"/>
+        <w:spacing w:after="120" w:before="320"/>
+      </w:pPr>
+      <w:r>
+        <w:t xml:space="preserve">28. Datasets in LeRobot v3.0, and a SmolVLA smoke test</w:t>
+      </w:r>
+    </w:p>
+    <w:p>
+      <w:pPr>
+        <w:spacing w:after="100"/>
+      </w:pPr>
+      <w:r>
+        <w:rPr>
+          <w:i/>
+          <w:iCs/>
+          <w:color w:val="4B5B57"/>
+        </w:rPr>
+        <w:t xml:space="preserve">2026-10-05: make the datasets load in the real LeRobot, and prove data → model → loss for SmolVLA.</w:t>
+      </w:r>
+    </w:p>
+    <w:p>
+      <w:pPr>
+        <w:spacing w:after="100"/>
+      </w:pPr>
+      <w:r>
+        <w:t xml:space="preserve">The first conversion (§26) was written by hand and did not load: </w:t>
+      </w:r>
+      <w:r>
+        <w:rPr>
+          <w:rFonts w:ascii="Consolas" w:cs="Consolas" w:eastAsia="Consolas" w:hAnsi="Consolas"/>
+          <w:color w:val="0E4A40"/>
+        </w:rPr>
+        <w:t xml:space="preserve">InvalidVersion: 'v3.0-manual'</w:t>
+      </w:r>
+      <w:r>
+        <w:t xml:space="preserve">. An audit before the loader found four more defects: </w:t>
+      </w:r>
+      <w:r>
+        <w:rPr>
+          <w:rFonts w:ascii="Consolas" w:cs="Consolas" w:eastAsia="Consolas" w:hAnsi="Consolas"/>
+          <w:color w:val="0E4A40"/>
+        </w:rPr>
+        <w:t xml:space="preserve">action[t]</w:t>
+      </w:r>
+      <w:r>
+        <w:t xml:space="preserve"> was exactly </w:t>
+      </w:r>
+      <w:r>
+        <w:rPr>
+          <w:rFonts w:ascii="Consolas" w:cs="Consolas" w:eastAsia="Consolas" w:hAnsi="Consolas"/>
+          <w:color w:val="0E4A40"/>
+        </w:rPr>
+        <w:t xml:space="preserve">state[t]</w:t>
+      </w:r>
+      <w:r>
+        <w:t xml:space="preserve"> (the right values at the wrong index), timestamps were bag receive time (625 frames over 106.8 s, for 20.6 s of simulation), the camera key differed per split (</w:t>
+      </w:r>
+      <w:r>
+        <w:rPr>
+          <w:rFonts w:ascii="Consolas" w:cs="Consolas" w:eastAsia="Consolas" w:hAnsi="Consolas"/>
+          <w:color w:val="0E4A40"/>
+        </w:rPr>
+        <w:t xml:space="preserve">table</w:t>
+      </w:r>
+      <w:r>
+        <w:t xml:space="preserve"> / </w:t>
+      </w:r>
+      <w:r>
+        <w:rPr>
+          <w:rFonts w:ascii="Consolas" w:cs="Consolas" w:eastAsia="Consolas" w:hAnsi="Consolas"/>
+          <w:color w:val="0E4A40"/>
+        </w:rPr>
+        <w:t xml:space="preserve">heldout</w:t>
+      </w:r>
+      <w:r>
+        <w:t xml:space="preserve">), and there were no statistics and no global index.</w:t>
+      </w:r>
+    </w:p>
+    <w:p>
+      <w:pPr>
+        <w:spacing w:after="100"/>
+      </w:pPr>
+      <w:r>
+        <w:rPr>
+          <w:b/>
+          <w:bCs/>
+        </w:rPr>
+        <w:t xml:space="preserve">The bags decided the action definition.</w:t>
+      </w:r>
+      <w:r>
+        <w:t xml:space="preserve"> They hold only </w:t>
+      </w:r>
+      <w:r>
+        <w:rPr>
+          <w:rFonts w:ascii="Consolas" w:cs="Consolas" w:eastAsia="Consolas" w:hAnsi="Consolas"/>
+          <w:color w:val="0E4A40"/>
+        </w:rPr>
+        <w:t xml:space="preserve">/joint_states</w:t>
+      </w:r>
+      <w:r>
+        <w:t xml:space="preserve"> (100 Hz in simulation time) and the camera (30 Hz), with no controller command or desired-state topic. So </w:t>
+      </w:r>
+      <w:r>
+        <w:rPr>
+          <w:rFonts w:ascii="Consolas" w:cs="Consolas" w:eastAsia="Consolas" w:hAnsi="Consolas"/>
+          <w:b/>
+          <w:bCs/>
+          <w:color w:val="0E4A40"/>
+        </w:rPr>
+        <w:t xml:space="preserve">action[t] = observation.state[t+1]</w:t>
+      </w:r>
+      <w:r>
+        <w:t xml:space="preserve">, and each episode's last frame is dropped. The contracts now record </w:t>
+      </w:r>
+      <w:r>
+        <w:rPr>
+          <w:rFonts w:ascii="Consolas" w:cs="Consolas" w:eastAsia="Consolas" w:hAnsi="Consolas"/>
+          <w:color w:val="0E4A40"/>
+        </w:rPr>
+        <w:t xml:space="preserve">/mycobot_controller/controller_state</w:t>
+      </w:r>
+      <w:r>
+        <w:t xml:space="preserve"> and </w:t>
+      </w:r>
+      <w:r>
+        <w:rPr>
+          <w:rFonts w:ascii="Consolas" w:cs="Consolas" w:eastAsia="Consolas" w:hAnsi="Consolas"/>
+          <w:color w:val="0E4A40"/>
+        </w:rPr>
+        <w:t xml:space="preserve">/gripper_position_controller/commands</w:t>
+      </w:r>
+      <w:r>
+        <w:t xml:space="preserve"> as </w:t>
+      </w:r>
+      <w:r>
+        <w:rPr>
+          <w:rFonts w:ascii="Consolas" w:cs="Consolas" w:eastAsia="Consolas" w:hAnsi="Consolas"/>
+          <w:color w:val="0E4A40"/>
+        </w:rPr>
+        <w:t xml:space="preserve">adjunct</w:t>
+      </w:r>
+      <w:r>
+        <w:t xml:space="preserve"> channels for future batches.</w:t>
+      </w:r>
+    </w:p>
+    <w:p>
+      <w:pPr>
+        <w:spacing w:after="100"/>
+      </w:pPr>
+      <w:r>
+        <w:rPr>
+          <w:rFonts w:ascii="Consolas" w:cs="Consolas" w:eastAsia="Consolas" w:hAnsi="Consolas"/>
+          <w:color w:val="0E4A40"/>
+        </w:rPr>
+        <w:t xml:space="preserve">port_bag.py</w:t>
+      </w:r>
+      <w:r>
+        <w:t xml:space="preserve"> was rewritten on LeRobot's own writer (</w:t>
+      </w:r>
+      <w:r>
+        <w:rPr>
+          <w:rFonts w:ascii="Consolas" w:cs="Consolas" w:eastAsia="Consolas" w:hAnsi="Consolas"/>
+          <w:color w:val="0E4A40"/>
+        </w:rPr>
+        <w:t xml:space="preserve">create</w:t>
+      </w:r>
+      <w:r>
+        <w:t xml:space="preserve"> / </w:t>
+      </w:r>
+      <w:r>
+        <w:rPr>
+          <w:rFonts w:ascii="Consolas" w:cs="Consolas" w:eastAsia="Consolas" w:hAnsi="Consolas"/>
+          <w:color w:val="0E4A40"/>
+        </w:rPr>
+        <w:t xml:space="preserve">add_frame</w:t>
+      </w:r>
+      <w:r>
+        <w:t xml:space="preserve"> / </w:t>
+      </w:r>
+      <w:r>
+        <w:rPr>
+          <w:rFonts w:ascii="Consolas" w:cs="Consolas" w:eastAsia="Consolas" w:hAnsi="Consolas"/>
+          <w:color w:val="0E4A40"/>
+        </w:rPr>
+        <w:t xml:space="preserve">save_episode</w:t>
+      </w:r>
+      <w:r>
+        <w:t xml:space="preserve"> / </w:t>
+      </w:r>
+      <w:r>
+        <w:rPr>
+          <w:rFonts w:ascii="Consolas" w:cs="Consolas" w:eastAsia="Consolas" w:hAnsi="Consolas"/>
+          <w:color w:val="0E4A40"/>
+        </w:rPr>
+        <w:t xml:space="preserve">finalize</w:t>
+      </w:r>
+      <w:r>
+        <w:t xml:space="preserve">), in a CPU-only venv on the WSL2 host (lerobot 0.4.4, CPU torch, 2.3 GB), reading the MCAP bags with </w:t>
+      </w:r>
+      <w:r>
+        <w:rPr>
+          <w:rFonts w:ascii="Consolas" w:cs="Consolas" w:eastAsia="Consolas" w:hAnsi="Consolas"/>
+          <w:color w:val="0E4A40"/>
+        </w:rPr>
+        <w:t xml:space="preserve">mcap-ros2-support</w:t>
+      </w:r>
+      <w:r>
+        <w:t xml:space="preserve">. </w:t>
+      </w:r>
+      <w:r>
+        <w:rPr>
+          <w:rFonts w:ascii="Consolas" w:cs="Consolas" w:eastAsia="Consolas" w:hAnsi="Consolas"/>
+          <w:color w:val="0E4A40"/>
+        </w:rPr>
+        <w:t xml:space="preserve">timestamp = frame_index / 30</w:t>
+      </w:r>
+      <w:r>
+        <w:t xml:space="preserve">; each image is paired with the joint state nearest in header (simulation) time: at most 6 ms once the joint-state stream has started, larger only on the camera frames recorded before it, where the arm is at rest. One image key, </w:t>
+      </w:r>
+      <w:r>
+        <w:rPr>
+          <w:rFonts w:ascii="Consolas" w:cs="Consolas" w:eastAsia="Consolas" w:hAnsi="Consolas"/>
+          <w:color w:val="0E4A40"/>
+        </w:rPr>
+        <w:t xml:space="preserve">observation.images.top</w:t>
+      </w:r>
+      <w:r>
+        <w:t xml:space="preserve">, in both splits; the camera configuration, </w:t>
+      </w:r>
+      <w:r>
+        <w:rPr>
+          <w:rFonts w:ascii="Consolas" w:cs="Consolas" w:eastAsia="Consolas" w:hAnsi="Consolas"/>
+          <w:color w:val="0E4A40"/>
+        </w:rPr>
+        <w:t xml:space="preserve">distractors_moved</w:t>
+      </w:r>
+      <w:r>
+        <w:t xml:space="preserve"> and the pairing gap per episode go in </w:t>
+      </w:r>
+      <w:r>
+        <w:rPr>
+          <w:rFonts w:ascii="Consolas" w:cs="Consolas" w:eastAsia="Consolas" w:hAnsi="Consolas"/>
+          <w:color w:val="0E4A40"/>
+        </w:rPr>
+        <w:t xml:space="preserve">meta/episodes_extra.jsonl</w:t>
+      </w:r>
+      <w:r>
+        <w:t xml:space="preserve">, because the 0.4.4 writer stores no custom per-episode field.</w:t>
+      </w:r>
+    </w:p>
+    <w:tbl>
+      <w:tblPr>
+        <w:tblW w:type="dxa" w:w="9360"/>
+        <w:tblBorders>
+          <w:top w:val="single" w:color="C4CBC7" w:sz="4"/>
+          <w:left w:val="single" w:color="C4CBC7" w:sz="4"/>
+          <w:bottom w:val="single" w:color="C4CBC7" w:sz="4"/>
+          <w:right w:val="single" w:color="C4CBC7" w:sz="4"/>
+          <w:insideH w:val="single" w:color="C4CBC7" w:sz="4"/>
+          <w:insideV w:val="single" w:color="C4CBC7" w:sz="4"/>
+        </w:tblBorders>
+        <w:tblLayout w:type="fixed"/>
+      </w:tblPr>
+      <w:tblGrid>
+        <w:gridCol w:w="3000"/>
+        <w:gridCol w:w="6360"/>
+      </w:tblGrid>
+      <w:tr>
+        <w:trPr>
+          <w:tblHeader/>
+        </w:trPr>
+        <w:tc>
+          <w:tcPr>
+            <w:tcW w:type="dxa" w:w="3000"/>
+            <w:shd w:fill="DEE3E0" w:val="clear"/>
+            <w:tcMar>
+              <w:top w:type="dxa" w:w="80"/>
+              <w:left w:type="dxa" w:w="100"/>
+              <w:bottom w:type="dxa" w:w="80"/>
+              <w:right w:type="dxa" w:w="100"/>
+            </w:tcMar>
+          </w:tcPr>
+          <w:p>
+            <w:r>
+              <w:rPr>
+                <w:b/>
+                <w:bCs/>
+                <w:color w:val="4B5B57"/>
+                <w:sz w:val="18"/>
+                <w:szCs w:val="18"/>
+              </w:rPr>
+              <w:t xml:space="preserve">Check (offline, lerobot 0.4.4)</w:t>
+            </w:r>
+          </w:p>
+        </w:tc>
+        <w:tc>
+          <w:tcPr>
+            <w:tcW w:type="dxa" w:w="6360"/>
+            <w:shd w:fill="DEE3E0" w:val="clear"/>
+            <w:tcMar>
+              <w:top w:type="dxa" w:w="80"/>
+              <w:left w:type="dxa" w:w="100"/>
+              <w:bottom w:type="dxa" w:w="80"/>
+              <w:right w:type="dxa" w:w="100"/>
+            </w:tcMar>
+          </w:tcPr>
+          <w:p>
+            <w:r>
+              <w:rPr>
+                <w:b/>
+                <w:bCs/>
+                <w:color w:val="4B5B57"/>
+                <w:sz w:val="18"/>
+                <w:szCs w:val="18"/>
+              </w:rPr>
+              <w:t xml:space="preserve">Result</w:t>
+            </w:r>
+          </w:p>
+        </w:tc>
+      </w:tr>
+      <w:tr>
+        <w:trPr>
+          <w:cantSplit/>
+        </w:trPr>
+        <w:tc>
+          <w:tcPr>
+            <w:tcW w:type="dxa" w:w="3000"/>
+            <w:tcMar>
+              <w:top w:type="dxa" w:w="80"/>
+              <w:left w:type="dxa" w:w="100"/>
+              <w:bottom w:type="dxa" w:w="80"/>
+              <w:right w:type="dxa" w:w="100"/>
+            </w:tcMar>
+          </w:tcPr>
+          <w:p>
+            <w:r>
+              <w:rPr>
+                <w:sz w:val="19"/>
+                <w:szCs w:val="19"/>
+              </w:rPr>
+              <w:t xml:space="preserve">a. both splits load</w:t>
+            </w:r>
+          </w:p>
+        </w:tc>
+        <w:tc>
+          <w:tcPr>
+            <w:tcW w:type="dxa" w:w="6360"/>
+            <w:tcMar>
+              <w:top w:type="dxa" w:w="80"/>
+              <w:left w:type="dxa" w:w="100"/>
+              <w:bottom w:type="dxa" w:w="80"/>
+              <w:right w:type="dxa" w:w="100"/>
+            </w:tcMar>
+          </w:tcPr>
+          <w:p>
+            <w:r>
+              <w:rPr>
+                <w:sz w:val="19"/>
+                <w:szCs w:val="19"/>
+              </w:rPr>
+              <w:t xml:space="preserve">yes, codebase v3.0</w:t>
+            </w:r>
+          </w:p>
+        </w:tc>
+      </w:tr>
+      <w:tr>
+        <w:trPr>
+          <w:cantSplit/>
+        </w:trPr>
+        <w:tc>
+          <w:tcPr>
+            <w:tcW w:type="dxa" w:w="3000"/>
+            <w:tcMar>
+              <w:top w:type="dxa" w:w="80"/>
+              <w:left w:type="dxa" w:w="100"/>
+              <w:bottom w:type="dxa" w:w="80"/>
+              <w:right w:type="dxa" w:w="100"/>
+            </w:tcMar>
+          </w:tcPr>
+          <w:p>
+            <w:r>
+              <w:rPr>
+                <w:sz w:val="19"/>
+                <w:szCs w:val="19"/>
+              </w:rPr>
+              <w:t xml:space="preserve">b. episodes / frames</w:t>
+            </w:r>
+          </w:p>
+        </w:tc>
+        <w:tc>
+          <w:tcPr>
+            <w:tcW w:type="dxa" w:w="6360"/>
+            <w:tcMar>
+              <w:top w:type="dxa" w:w="80"/>
+              <w:left w:type="dxa" w:w="100"/>
+              <w:bottom w:type="dxa" w:w="80"/>
+              <w:right w:type="dxa" w:w="100"/>
+            </w:tcMar>
+          </w:tcPr>
+          <w:p>
+            <w:r>
+              <w:rPr>
+                <w:sz w:val="19"/>
+                <w:szCs w:val="19"/>
+              </w:rPr>
+              <w:t xml:space="preserve">48 / 29 687 and 12 / 7 411 (one frame fewer per episode)</w:t>
+            </w:r>
+          </w:p>
+        </w:tc>
+      </w:tr>
+      <w:tr>
+        <w:trPr>
+          <w:cantSplit/>
+        </w:trPr>
+        <w:tc>
+          <w:tcPr>
+            <w:tcW w:type="dxa" w:w="3000"/>
+            <w:tcMar>
+              <w:top w:type="dxa" w:w="80"/>
+              <w:left w:type="dxa" w:w="100"/>
+              <w:bottom w:type="dxa" w:w="80"/>
+              <w:right w:type="dxa" w:w="100"/>
+            </w:tcMar>
+          </w:tcPr>
+          <w:p>
+            <w:r>
+              <w:rPr>
+                <w:sz w:val="19"/>
+                <w:szCs w:val="19"/>
+              </w:rPr>
+              <w:t xml:space="preserve">c. </w:t>
+            </w:r>
+            <w:r>
+              <w:rPr>
+                <w:rFonts w:ascii="Consolas" w:cs="Consolas" w:eastAsia="Consolas" w:hAnsi="Consolas"/>
+                <w:color w:val="0E4A40"/>
+              </w:rPr>
+              <w:t xml:space="preserve">action[t] == state[t+1]</w:t>
+            </w:r>
+          </w:p>
+        </w:tc>
+        <w:tc>
+          <w:tcPr>
+            <w:tcW w:type="dxa" w:w="6360"/>
+            <w:tcMar>
+              <w:top w:type="dxa" w:w="80"/>
+              <w:left w:type="dxa" w:w="100"/>
+              <w:bottom w:type="dxa" w:w="80"/>
+              <w:right w:type="dxa" w:w="100"/>
+            </w:tcMar>
+          </w:tcPr>
+          <w:p>
+            <w:r>
+              <w:rPr>
+                <w:sz w:val="19"/>
+                <w:szCs w:val="19"/>
+              </w:rPr>
+              <w:t xml:space="preserve">every row of a full episode; last row equals the dropped frame in the bag</w:t>
+            </w:r>
+          </w:p>
+        </w:tc>
+      </w:tr>
+      <w:tr>
+        <w:trPr>
+          <w:cantSplit/>
+        </w:trPr>
+        <w:tc>
+          <w:tcPr>
+            <w:tcW w:type="dxa" w:w="3000"/>
+            <w:tcMar>
+              <w:top w:type="dxa" w:w="80"/>
+              <w:left w:type="dxa" w:w="100"/>
+              <w:bottom w:type="dxa" w:w="80"/>
+              <w:right w:type="dxa" w:w="100"/>
+            </w:tcMar>
+          </w:tcPr>
+          <w:p>
+            <w:r>
+              <w:rPr>
+                <w:sz w:val="19"/>
+                <w:szCs w:val="19"/>
+              </w:rPr>
+              <w:t xml:space="preserve">d. timestamp to frame</w:t>
+            </w:r>
+          </w:p>
+        </w:tc>
+        <w:tc>
+          <w:tcPr>
+            <w:tcW w:type="dxa" w:w="6360"/>
+            <w:tcMar>
+              <w:top w:type="dxa" w:w="80"/>
+              <w:left w:type="dxa" w:w="100"/>
+              <w:bottom w:type="dxa" w:w="80"/>
+              <w:right w:type="dxa" w:w="100"/>
+            </w:tcMar>
+          </w:tcPr>
+          <w:p>
+            <w:r>
+              <w:rPr>
+                <w:sz w:val="19"/>
+                <w:szCs w:val="19"/>
+              </w:rPr>
+              <w:t xml:space="preserve">loader image = frame decoded straight from the MP4 (10 rows, max difference 0); on the 7 with moving pixels it matches the raw bag image at t, not t±1</w:t>
+            </w:r>
+          </w:p>
+        </w:tc>
+      </w:tr>
+      <w:tr>
+        <w:trPr>
+          <w:cantSplit/>
+        </w:trPr>
+        <w:tc>
+          <w:tcPr>
+            <w:tcW w:type="dxa" w:w="3000"/>
+            <w:tcMar>
+              <w:top w:type="dxa" w:w="80"/>
+              <w:left w:type="dxa" w:w="100"/>
+              <w:bottom w:type="dxa" w:w="80"/>
+              <w:right w:type="dxa" w:w="100"/>
+            </w:tcMar>
+          </w:tcPr>
+          <w:p>
+            <w:r>
+              <w:rPr>
+                <w:sz w:val="19"/>
+                <w:szCs w:val="19"/>
+              </w:rPr>
+              <w:t xml:space="preserve">e. statistics</w:t>
+            </w:r>
+          </w:p>
+        </w:tc>
+        <w:tc>
+          <w:tcPr>
+            <w:tcW w:type="dxa" w:w="6360"/>
+            <w:tcMar>
+              <w:top w:type="dxa" w:w="80"/>
+              <w:left w:type="dxa" w:w="100"/>
+              <w:bottom w:type="dxa" w:w="80"/>
+              <w:right w:type="dxa" w:w="100"/>
+            </w:tcMar>
+          </w:tcPr>
+          <w:p>
+            <w:r>
+              <w:rPr>
+                <w:sz w:val="19"/>
+                <w:szCs w:val="19"/>
+              </w:rPr>
+              <w:t xml:space="preserve">state, action, image; every joint std ≥ 0.249 rad</w:t>
+            </w:r>
+          </w:p>
+        </w:tc>
+      </w:tr>
+      <w:tr>
+        <w:trPr>
+          <w:cantSplit/>
+        </w:trPr>
+        <w:tc>
+          <w:tcPr>
+            <w:tcW w:type="dxa" w:w="3000"/>
+            <w:tcMar>
+              <w:top w:type="dxa" w:w="80"/>
+              <w:left w:type="dxa" w:w="100"/>
+              <w:bottom w:type="dxa" w:w="80"/>
+              <w:right w:type="dxa" w:w="100"/>
+            </w:tcMar>
+          </w:tcPr>
+          <w:p>
+            <w:r>
+              <w:rPr>
+                <w:sz w:val="19"/>
+                <w:szCs w:val="19"/>
+              </w:rPr>
+              <w:t xml:space="preserve">f. image key</w:t>
+            </w:r>
+          </w:p>
+        </w:tc>
+        <w:tc>
+          <w:tcPr>
+            <w:tcW w:type="dxa" w:w="6360"/>
+            <w:tcMar>
+              <w:top w:type="dxa" w:w="80"/>
+              <w:left w:type="dxa" w:w="100"/>
+              <w:bottom w:type="dxa" w:w="80"/>
+              <w:right w:type="dxa" w:w="100"/>
+            </w:tcMar>
+          </w:tcPr>
+          <w:p>
+            <w:r>
+              <w:rPr>
+                <w:rFonts w:ascii="Consolas" w:cs="Consolas" w:eastAsia="Consolas" w:hAnsi="Consolas"/>
+                <w:color w:val="0E4A40"/>
+              </w:rPr>
+              <w:t xml:space="preserve">observation.images.top</w:t>
+            </w:r>
+            <w:r>
+              <w:rPr>
+                <w:sz w:val="19"/>
+                <w:szCs w:val="19"/>
+              </w:rPr>
+              <w:t xml:space="preserve"> in both splits</w:t>
+            </w:r>
+          </w:p>
+        </w:tc>
+      </w:tr>
+    </w:tbl>
+    <w:p>
+      <w:pPr>
+        <w:spacing w:after="120"/>
+      </w:pPr>
+    </w:p>
+    <w:p>
+      <w:pPr>
+        <w:spacing w:after="100"/>
+      </w:pPr>
+      <w:r>
+        <w:rPr>
+          <w:b/>
+          <w:bCs/>
+        </w:rPr>
+        <w:t xml:space="preserve">SmolVLA smoke-train</w:t>
+      </w:r>
+      <w:r>
+        <w:t xml:space="preserve"> (</w:t>
+      </w:r>
+      <w:r>
+        <w:rPr>
+          <w:rFonts w:ascii="Consolas" w:cs="Consolas" w:eastAsia="Consolas" w:hAnsi="Consolas"/>
+          <w:color w:val="0E4A40"/>
+        </w:rPr>
+        <w:t xml:space="preserve">lerobot/smolvla_base</w:t>
+      </w:r>
+      <w:r>
+        <w:t xml:space="preserve">, CPU, batch size 1, 10 steps, with </w:t>
+      </w:r>
+      <w:r>
+        <w:rPr>
+          <w:rFonts w:ascii="Consolas" w:cs="Consolas" w:eastAsia="Consolas" w:hAnsi="Consolas"/>
+          <w:color w:val="0E4A40"/>
+        </w:rPr>
+        <w:t xml:space="preserve">--rename_map='{"observation.images.top": "observation.images.camera1"}'</w:t>
+      </w:r>
+      <w:r>
+        <w:t xml:space="preserve"> since the pretrained policy names its cameras </w:t>
+      </w:r>
+      <w:r>
+        <w:rPr>
+          <w:rFonts w:ascii="Consolas" w:cs="Consolas" w:eastAsia="Consolas" w:hAnsi="Consolas"/>
+          <w:color w:val="0E4A40"/>
+        </w:rPr>
+        <w:t xml:space="preserve">camera1</w:t>
+      </w:r>
+      <w:r>
+        <w:t xml:space="preserve">–</w:t>
+      </w:r>
+      <w:r>
+        <w:rPr>
+          <w:rFonts w:ascii="Consolas" w:cs="Consolas" w:eastAsia="Consolas" w:hAnsi="Consolas"/>
+          <w:color w:val="0E4A40"/>
+        </w:rPr>
+        <w:t xml:space="preserve">camera3</w:t>
+      </w:r>
+      <w:r>
+        <w:t xml:space="preserve">): loss finite at every step (0.117–2.371), ~4.1 s per step, peak RAM 3.5 GB. 100 M of 450 M parameters trainable: the action expert only, the vision-language backbone frozen, as the 0.4.4 defaults and the checkpoint's own config set (</w:t>
+      </w:r>
+      <w:r>
+        <w:rPr>
+          <w:rFonts w:ascii="Consolas" w:cs="Consolas" w:eastAsia="Consolas" w:hAnsi="Consolas"/>
+          <w:color w:val="0E4A40"/>
+        </w:rPr>
+        <w:t xml:space="preserve">freeze_vision_encoder</w:t>
+      </w:r>
+      <w:r>
+        <w:t xml:space="preserve">, </w:t>
+      </w:r>
+      <w:r>
+        <w:rPr>
+          <w:rFonts w:ascii="Consolas" w:cs="Consolas" w:eastAsia="Consolas" w:hAnsi="Consolas"/>
+          <w:color w:val="0E4A40"/>
+        </w:rPr>
+        <w:t xml:space="preserve">train_expert_only</w:t>
+      </w:r>
+      <w:r>
+        <w:t xml:space="preserve">).</w:t>
+      </w:r>
+    </w:p>
+    <w:p>
+      <w:pPr>
+        <w:pBdr>
+          <w:left w:val="single" w:color="8A5A12" w:sz="24"/>
+        </w:pBdr>
+        <w:shd w:fill="F5F5F3" w:val="clear"/>
+        <w:spacing w:after="160" w:before="120"/>
+        <w:ind w:left="200"/>
+      </w:pPr>
+      <w:r>
+        <w:rPr>
+          <w:b/>
+          <w:bCs/>
+        </w:rPr>
+        <w:t xml:space="preserve">lerobot 0.4.4 is a provisional pin</w:t>
+      </w:r>
+      <w:r>
+        <w:t xml:space="preserve"> (the current release), kept in one place, </w:t>
+      </w:r>
+      <w:r>
+        <w:rPr>
+          <w:rFonts w:ascii="Consolas" w:cs="Consolas" w:eastAsia="Consolas" w:hAnsi="Consolas"/>
+          <w:color w:val="0E4A40"/>
+        </w:rPr>
+        <w:t xml:space="preserve">scripts/requirements-lerobot.txt</w:t>
+      </w:r>
+      <w:r>
+        <w:t xml:space="preserve">, which </w:t>
+      </w:r>
+      <w:r>
+        <w:rPr>
+          <w:rFonts w:ascii="Consolas" w:cs="Consolas" w:eastAsia="Consolas" w:hAnsi="Consolas"/>
+          <w:color w:val="0E4A40"/>
+        </w:rPr>
+        <w:t xml:space="preserve">port_bag.py</w:t>
+      </w:r>
+      <w:r>
+        <w:t xml:space="preserve"> enforces. The team's training version is still to be confirmed; changing it is one line plus a re-conversion. Video decoding used PyAV: the default decoder, torchcodec, needs FFmpeg's shared libraries on the host (</w:t>
+      </w:r>
+      <w:r>
+        <w:rPr>
+          <w:rFonts w:ascii="Consolas" w:cs="Consolas" w:eastAsia="Consolas" w:hAnsi="Consolas"/>
+          <w:color w:val="0E4A40"/>
+        </w:rPr>
+        <w:t xml:space="preserve">sudo apt install ffmpeg</w:t>
+      </w:r>
+      <w:r>
+        <w:t xml:space="preserve">).</w:t>
       </w:r>
     </w:p>
     <w:p>
@@ -12951,6 +13716,287 @@
           </w:p>
         </w:tc>
       </w:tr>
+      <w:tr>
+        <w:trPr>
+          <w:cantSplit/>
+        </w:trPr>
+        <w:tc>
+          <w:tcPr>
+            <w:tcW w:type="dxa" w:w="2900"/>
+            <w:tcMar>
+              <w:top w:type="dxa" w:w="80"/>
+              <w:left w:type="dxa" w:w="100"/>
+              <w:bottom w:type="dxa" w:w="80"/>
+              <w:right w:type="dxa" w:w="100"/>
+            </w:tcMar>
+          </w:tcPr>
+          <w:p>
+            <w:r>
+              <w:rPr>
+                <w:sz w:val="19"/>
+                <w:szCs w:val="19"/>
+              </w:rPr>
+              <w:t xml:space="preserve">Datasets would not load: </w:t>
+            </w:r>
+            <w:r>
+              <w:rPr>
+                <w:rFonts w:ascii="Consolas" w:cs="Consolas" w:eastAsia="Consolas" w:hAnsi="Consolas"/>
+                <w:color w:val="0E4A40"/>
+              </w:rPr>
+              <w:t xml:space="preserve">InvalidVersion: 'v3.0-manual'</w:t>
+            </w:r>
+          </w:p>
+        </w:tc>
+        <w:tc>
+          <w:tcPr>
+            <w:tcW w:type="dxa" w:w="3300"/>
+            <w:tcMar>
+              <w:top w:type="dxa" w:w="80"/>
+              <w:left w:type="dxa" w:w="100"/>
+              <w:bottom w:type="dxa" w:w="80"/>
+              <w:right w:type="dxa" w:w="100"/>
+            </w:tcMar>
+          </w:tcPr>
+          <w:p>
+            <w:r>
+              <w:rPr>
+                <w:sz w:val="19"/>
+                <w:szCs w:val="19"/>
+              </w:rPr>
+              <w:t xml:space="preserve">hand-written layout (v2.x files, no statistics)</w:t>
+            </w:r>
+          </w:p>
+        </w:tc>
+        <w:tc>
+          <w:tcPr>
+            <w:tcW w:type="dxa" w:w="3160"/>
+            <w:tcMar>
+              <w:top w:type="dxa" w:w="80"/>
+              <w:left w:type="dxa" w:w="100"/>
+              <w:bottom w:type="dxa" w:w="80"/>
+              <w:right w:type="dxa" w:w="100"/>
+            </w:tcMar>
+          </w:tcPr>
+          <w:p>
+            <w:r>
+              <w:rPr>
+                <w:sz w:val="19"/>
+                <w:szCs w:val="19"/>
+              </w:rPr>
+              <w:t xml:space="preserve">LeRobot's own writer, §28</w:t>
+            </w:r>
+          </w:p>
+        </w:tc>
+      </w:tr>
+      <w:tr>
+        <w:trPr>
+          <w:cantSplit/>
+        </w:trPr>
+        <w:tc>
+          <w:tcPr>
+            <w:tcW w:type="dxa" w:w="2900"/>
+            <w:tcMar>
+              <w:top w:type="dxa" w:w="80"/>
+              <w:left w:type="dxa" w:w="100"/>
+              <w:bottom w:type="dxa" w:w="80"/>
+              <w:right w:type="dxa" w:w="100"/>
+            </w:tcMar>
+          </w:tcPr>
+          <w:p>
+            <w:r>
+              <w:rPr>
+                <w:sz w:val="19"/>
+                <w:szCs w:val="19"/>
+              </w:rPr>
+              <w:t xml:space="preserve">action[t] equal to state[t]</w:t>
+            </w:r>
+          </w:p>
+        </w:tc>
+        <w:tc>
+          <w:tcPr>
+            <w:tcW w:type="dxa" w:w="3300"/>
+            <w:tcMar>
+              <w:top w:type="dxa" w:w="80"/>
+              <w:left w:type="dxa" w:w="100"/>
+              <w:bottom w:type="dxa" w:w="80"/>
+              <w:right w:type="dxa" w:w="100"/>
+            </w:tcMar>
+          </w:tcPr>
+          <w:p>
+            <w:r>
+              <w:rPr>
+                <w:sz w:val="19"/>
+                <w:szCs w:val="19"/>
+              </w:rPr>
+              <w:t xml:space="preserve">converter wrote the next state at the wrong index</w:t>
+            </w:r>
+          </w:p>
+        </w:tc>
+        <w:tc>
+          <w:tcPr>
+            <w:tcW w:type="dxa" w:w="3160"/>
+            <w:tcMar>
+              <w:top w:type="dxa" w:w="80"/>
+              <w:left w:type="dxa" w:w="100"/>
+              <w:bottom w:type="dxa" w:w="80"/>
+              <w:right w:type="dxa" w:w="100"/>
+            </w:tcMar>
+          </w:tcPr>
+          <w:p>
+            <w:r>
+              <w:rPr>
+                <w:sz w:val="19"/>
+                <w:szCs w:val="19"/>
+              </w:rPr>
+              <w:t xml:space="preserve">action[t] = state[t+1], last frame dropped, §28</w:t>
+            </w:r>
+          </w:p>
+        </w:tc>
+      </w:tr>
+      <w:tr>
+        <w:trPr>
+          <w:cantSplit/>
+        </w:trPr>
+        <w:tc>
+          <w:tcPr>
+            <w:tcW w:type="dxa" w:w="2900"/>
+            <w:tcMar>
+              <w:top w:type="dxa" w:w="80"/>
+              <w:left w:type="dxa" w:w="100"/>
+              <w:bottom w:type="dxa" w:w="80"/>
+              <w:right w:type="dxa" w:w="100"/>
+            </w:tcMar>
+          </w:tcPr>
+          <w:p>
+            <w:r>
+              <w:rPr>
+                <w:sz w:val="19"/>
+                <w:szCs w:val="19"/>
+              </w:rPr>
+              <w:t xml:space="preserve">625 frames spanning 106.8 s</w:t>
+            </w:r>
+          </w:p>
+        </w:tc>
+        <w:tc>
+          <w:tcPr>
+            <w:tcW w:type="dxa" w:w="3300"/>
+            <w:tcMar>
+              <w:top w:type="dxa" w:w="80"/>
+              <w:left w:type="dxa" w:w="100"/>
+              <w:bottom w:type="dxa" w:w="80"/>
+              <w:right w:type="dxa" w:w="100"/>
+            </w:tcMar>
+          </w:tcPr>
+          <w:p>
+            <w:r>
+              <w:rPr>
+                <w:sz w:val="19"/>
+                <w:szCs w:val="19"/>
+              </w:rPr>
+              <w:t xml:space="preserve">bag receive (wall) time used as timestamps</w:t>
+            </w:r>
+          </w:p>
+        </w:tc>
+        <w:tc>
+          <w:tcPr>
+            <w:tcW w:type="dxa" w:w="3160"/>
+            <w:tcMar>
+              <w:top w:type="dxa" w:w="80"/>
+              <w:left w:type="dxa" w:w="100"/>
+              <w:bottom w:type="dxa" w:w="80"/>
+              <w:right w:type="dxa" w:w="100"/>
+            </w:tcMar>
+          </w:tcPr>
+          <w:p>
+            <w:r>
+              <w:rPr>
+                <w:sz w:val="19"/>
+                <w:szCs w:val="19"/>
+              </w:rPr>
+              <w:t xml:space="preserve">timestamp = frame_index / fps; pairing on header time, §28</w:t>
+            </w:r>
+          </w:p>
+        </w:tc>
+      </w:tr>
+      <w:tr>
+        <w:trPr>
+          <w:cantSplit/>
+        </w:trPr>
+        <w:tc>
+          <w:tcPr>
+            <w:tcW w:type="dxa" w:w="2900"/>
+            <w:tcMar>
+              <w:top w:type="dxa" w:w="80"/>
+              <w:left w:type="dxa" w:w="100"/>
+              <w:bottom w:type="dxa" w:w="80"/>
+              <w:right w:type="dxa" w:w="100"/>
+            </w:tcMar>
+          </w:tcPr>
+          <w:p>
+            <w:r>
+              <w:rPr>
+                <w:sz w:val="19"/>
+                <w:szCs w:val="19"/>
+              </w:rPr>
+              <w:t xml:space="preserve">Held-out camera key differed from train</w:t>
+            </w:r>
+          </w:p>
+        </w:tc>
+        <w:tc>
+          <w:tcPr>
+            <w:tcW w:type="dxa" w:w="3300"/>
+            <w:tcMar>
+              <w:top w:type="dxa" w:w="80"/>
+              <w:left w:type="dxa" w:w="100"/>
+              <w:bottom w:type="dxa" w:w="80"/>
+              <w:right w:type="dxa" w:w="100"/>
+            </w:tcMar>
+          </w:tcPr>
+          <w:p>
+            <w:r>
+              <w:rPr>
+                <w:sz w:val="19"/>
+                <w:szCs w:val="19"/>
+              </w:rPr>
+              <w:t xml:space="preserve">one key per contract (table / heldout)</w:t>
+            </w:r>
+          </w:p>
+        </w:tc>
+        <w:tc>
+          <w:tcPr>
+            <w:tcW w:type="dxa" w:w="3160"/>
+            <w:tcMar>
+              <w:top w:type="dxa" w:w="80"/>
+              <w:left w:type="dxa" w:w="100"/>
+              <w:bottom w:type="dxa" w:w="80"/>
+              <w:right w:type="dxa" w:w="100"/>
+            </w:tcMar>
+          </w:tcPr>
+          <w:p>
+            <w:r>
+              <w:rPr>
+                <w:sz w:val="19"/>
+                <w:szCs w:val="19"/>
+              </w:rPr>
+              <w:t xml:space="preserve">one key, </w:t>
+            </w:r>
+            <w:r>
+              <w:rPr>
+                <w:rFonts w:ascii="Consolas" w:cs="Consolas" w:eastAsia="Consolas" w:hAnsi="Consolas"/>
+                <w:color w:val="0E4A40"/>
+              </w:rPr>
+              <w:t xml:space="preserve">observation.images.top</w:t>
+            </w:r>
+            <w:r>
+              <w:rPr>
+                <w:sz w:val="19"/>
+                <w:szCs w:val="19"/>
+              </w:rPr>
+              <w:t xml:space="preserve">, §28</w:t>
+            </w:r>
+          </w:p>
+        </w:tc>
+      </w:tr>
     </w:tbl>
     <w:p>
       <w:pPr>
@@ -13120,7 +14166,27 @@
         <w:t xml:space="preserve">Still true from the specification:</w:t>
       </w:r>
       <w:r>
-        <w:t xml:space="preserve"> weld, not grasp; ground-truth poses and scripted selection; visual domain gap; sixty episodes is a smoke test, not a training set; the datasets have not been loaded by the real </w:t>
+        <w:t xml:space="preserve"> weld, not grasp; ground-truth poses and scripted selection; visual domain gap; sixty episodes is a smoke test, not a training set.</w:t>
+      </w:r>
+    </w:p>
+    <w:p>
+      <w:pPr>
+        <w:pStyle w:val="ListParagraph"/>
+        <w:numPr>
+          <w:ilvl w:val="0"/>
+          <w:numId w:val="1"/>
+        </w:numPr>
+        <w:spacing w:after="100"/>
+      </w:pPr>
+      <w:r>
+        <w:rPr>
+          <w:b/>
+          <w:bCs/>
+        </w:rPr>
+        <w:t xml:space="preserve">Datasets checked, not trained.</w:t>
+      </w:r>
+      <w:r>
+        <w:t xml:space="preserve"> They load with the real </w:t>
       </w:r>
       <w:r>
         <w:rPr>
@@ -13130,7 +14196,7 @@
         <w:t xml:space="preserve">LeRobotDataset</w:t>
       </w:r>
       <w:r>
-        <w:t xml:space="preserve"> class (needs PyTorch).</w:t>
+        <w:t xml:space="preserve"> under lerobot 0.4.4, a provisional pin to be confirmed against the team's version; SmolVLA has run 10 CPU training steps on them, which proves data → model → loss, not a policy (§28).</w:t>
       </w:r>
     </w:p>
     <w:p>
@@ -13146,7 +14212,7 @@
           <w:sz w:val="24"/>
           <w:szCs w:val="24"/>
         </w:rPr>
-        <w:t xml:space="preserve">Manual execution, as run on 2026-10-04</w:t>
+        <w:t xml:space="preserve">Manual execution, as run on 2026-10-04 and 2026-10-05</w:t>
       </w:r>
     </w:p>
     <w:p>
@@ -13444,7 +14510,7 @@
           <w:sz w:val="17"/>
           <w:szCs w:val="17"/>
         </w:rPr>
-        <w:t xml:space="preserve"># 5. after the batch, in a container shell (step 2 again)</w:t>
+        <w:t xml:space="preserve"># 5. after the batch, WSL2 host: copy the bags and episode metadata out, convert in the CPU venv (§28)</w:t>
       </w:r>
     </w:p>
     <w:p>
@@ -13459,7 +14525,7 @@
           <w:sz w:val="17"/>
           <w:szCs w:val="17"/>
         </w:rPr>
-        <w:t xml:space="preserve">cd /workspace/htgspp</w:t>
+        <w:t xml:space="preserve">docker cp gazebo_to_lerobot:/workspace/htgspp/bags &lt;copy&gt;/  # and episodes/*/*.json</w:t>
       </w:r>
     </w:p>
     <w:p>
@@ -13474,7 +14540,7 @@
           <w:sz w:val="17"/>
           <w:szCs w:val="17"/>
         </w:rPr>
-        <w:t xml:space="preserve">python3 scripts/port_bag.py --split train   --out datasets/mycobot_sorting_train</w:t>
+        <w:t xml:space="preserve">V=~/venvs/lerobot044-cpu/bin/python   # pinned in scripts/requirements-lerobot.txt</w:t>
       </w:r>
     </w:p>
     <w:p>
@@ -13489,7 +14555,22 @@
           <w:sz w:val="17"/>
           <w:szCs w:val="17"/>
         </w:rPr>
-        <w:t xml:space="preserve">python3 scripts/port_bag.py --split heldout --out datasets/mycobot_sorting_heldout</w:t>
+        <w:t xml:space="preserve">$V scripts/port_bag.py --split train   --out datasets/mycobot_sorting_train   --episodes-dir &lt;copy&gt;/episodes --bags-dir &lt;copy&gt;/bags</w:t>
+      </w:r>
+    </w:p>
+    <w:p>
+      <w:pPr>
+        <w:shd w:fill="10201D" w:val="clear"/>
+        <w:spacing w:after="0"/>
+      </w:pPr>
+      <w:r>
+        <w:rPr>
+          <w:rFonts w:ascii="Consolas" w:cs="Consolas" w:eastAsia="Consolas" w:hAnsi="Consolas"/>
+          <w:color w:val="D9EDE8"/>
+          <w:sz w:val="17"/>
+          <w:szCs w:val="17"/>
+        </w:rPr>
+        <w:t xml:space="preserve">$V scripts/port_bag.py --split heldout --out datasets/mycobot_sorting_heldout --episodes-dir &lt;copy&gt;/episodes --bags-dir &lt;copy&gt;/bags</w:t>
       </w:r>
     </w:p>
     <w:p>
@@ -14195,6 +15276,103 @@
                 <w:szCs w:val="19"/>
               </w:rPr>
               <w:t xml:space="preserve">§16, the bench with no objects or bins</w:t>
+            </w:r>
+          </w:p>
+        </w:tc>
+      </w:tr>
+      <w:tr>
+        <w:trPr>
+          <w:cantSplit/>
+        </w:trPr>
+        <w:tc>
+          <w:tcPr>
+            <w:tcW w:type="dxa" w:w="5400"/>
+            <w:tcMar>
+              <w:top w:type="dxa" w:w="80"/>
+              <w:left w:type="dxa" w:w="100"/>
+              <w:bottom w:type="dxa" w:w="80"/>
+              <w:right w:type="dxa" w:w="100"/>
+            </w:tcMar>
+          </w:tcPr>
+          <w:p>
+            <w:r>
+              <w:rPr>
+                <w:rFonts w:ascii="Consolas" w:cs="Consolas" w:eastAsia="Consolas" w:hAnsi="Consolas"/>
+                <w:color w:val="0E4A40"/>
+              </w:rPr>
+              <w:t xml:space="preserve">scripts/requirements-lerobot.txt</w:t>
+            </w:r>
+          </w:p>
+        </w:tc>
+        <w:tc>
+          <w:tcPr>
+            <w:tcW w:type="dxa" w:w="3960"/>
+            <w:tcMar>
+              <w:top w:type="dxa" w:w="80"/>
+              <w:left w:type="dxa" w:w="100"/>
+              <w:bottom w:type="dxa" w:w="80"/>
+              <w:right w:type="dxa" w:w="100"/>
+            </w:tcMar>
+          </w:tcPr>
+          <w:p>
+            <w:r>
+              <w:rPr>
+                <w:sz w:val="19"/>
+                <w:szCs w:val="19"/>
+              </w:rPr>
+              <w:t xml:space="preserve">§28, the one place the LeRobot version is pinned</w:t>
+            </w:r>
+          </w:p>
+        </w:tc>
+      </w:tr>
+      <w:tr>
+        <w:trPr>
+          <w:cantSplit/>
+        </w:trPr>
+        <w:tc>
+          <w:tcPr>
+            <w:tcW w:type="dxa" w:w="5400"/>
+            <w:tcMar>
+              <w:top w:type="dxa" w:w="80"/>
+              <w:left w:type="dxa" w:w="100"/>
+              <w:bottom w:type="dxa" w:w="80"/>
+              <w:right w:type="dxa" w:w="100"/>
+            </w:tcMar>
+          </w:tcPr>
+          <w:p>
+            <w:r>
+              <w:rPr>
+                <w:rFonts w:ascii="Consolas" w:cs="Consolas" w:eastAsia="Consolas" w:hAnsi="Consolas"/>
+                <w:color w:val="0E4A40"/>
+              </w:rPr>
+              <w:t xml:space="preserve">scripts/port_bag.py</w:t>
+            </w:r>
+            <w:r>
+              <w:rPr>
+                <w:sz w:val="19"/>
+                <w:szCs w:val="19"/>
+              </w:rPr>
+              <w:t xml:space="preserve"> (rewritten)</w:t>
+            </w:r>
+          </w:p>
+        </w:tc>
+        <w:tc>
+          <w:tcPr>
+            <w:tcW w:type="dxa" w:w="3960"/>
+            <w:tcMar>
+              <w:top w:type="dxa" w:w="80"/>
+              <w:left w:type="dxa" w:w="100"/>
+              <w:bottom w:type="dxa" w:w="80"/>
+              <w:right w:type="dxa" w:w="100"/>
+            </w:tcMar>
+          </w:tcPr>
+          <w:p>
+            <w:r>
+              <w:rPr>
+                <w:sz w:val="19"/>
+                <w:szCs w:val="19"/>
+              </w:rPr>
+              <w:t xml:space="preserve">§28, conversion with LeRobot's own writer, CPU venv</w:t>
             </w:r>
           </w:p>
         </w:tc>

</xml_diff>

<commit_message>
docs(sorting): make the dataset re-conversion a visible, dated correction
The 2026-10-04 frame counts (29,735 / 7,423) had been overwritten with
the re-converted ones (29,687 / 7,411) without saying so. Every place
that quoted or replaced them now carries a dated correction with both
figures and the reason (action one frame early, wall-clock timestamps,
a different camera key per split, no statistics; that conversion also
did not load): report section 26 (EN/FR, HTML + Word), specification
Appendix C.1, datasets/README.md, MEASUREMENTS.md section 10, and the
04/10 CHANGELOG entry.
</commit_message>
<xml_diff>
--- a/Headless_Task-Grounded_Pick-and-Sort-and-Place_in_Gazebo/doc/FOUR_OBJECT_SORTING_REPORT.docx
+++ b/Headless_Task-Grounded_Pick-and-Sort-and-Place_in_Gazebo/doc/FOUR_OBJECT_SORTING_REPORT.docx
@@ -11413,6 +11413,56 @@
       </w:r>
       <w:r>
         <w:t xml:space="preserve"> 12 episodes, 7 411 frames; 320×240 at 30 fps, LeRobot v3.0. Spec Part 13 metrics for the scripted demonstrator: task success 60/60, correct-bin 60/60, held-out success 12/12, placement offset median 0.031 of the inner radius (max 0.149), distractor disturbance 1/60, yield 60 clean episodes from 60 attempts.</w:t>
+      </w:r>
+    </w:p>
+    <w:p>
+      <w:pPr>
+        <w:pBdr>
+          <w:left w:val="single" w:color="9C3B23" w:sz="24"/>
+        </w:pBdr>
+        <w:shd w:fill="F5F5F3" w:val="clear"/>
+        <w:spacing w:after="160" w:before="120"/>
+        <w:ind w:left="200"/>
+      </w:pPr>
+      <w:r>
+        <w:rPr>
+          <w:b/>
+          <w:bCs/>
+        </w:rPr>
+        <w:t xml:space="preserve">Correction, 2026-10-05: the conversion was redone.</w:t>
+      </w:r>
+      <w:r>
+        <w:t xml:space="preserve"> This section first gave 29 735 / 7 423 frames, from a hand-written conversion of 2026-10-04. Redone on 2026-10-05 with LeRobot's own writer, it gives </w:t>
+      </w:r>
+      <w:r>
+        <w:rPr>
+          <w:b/>
+          <w:bCs/>
+        </w:rPr>
+        <w:t xml:space="preserve">29 687 / 7 411</w:t>
+      </w:r>
+      <w:r>
+        <w:t xml:space="preserve">, one frame fewer per episode. Why: the action was one frame early (</w:t>
+      </w:r>
+      <w:r>
+        <w:rPr>
+          <w:rFonts w:ascii="Consolas" w:cs="Consolas" w:eastAsia="Consolas" w:hAnsi="Consolas"/>
+          <w:color w:val="0E4A40"/>
+        </w:rPr>
+        <w:t xml:space="preserve">action[t]</w:t>
+      </w:r>
+      <w:r>
+        <w:t xml:space="preserve"> equal to </w:t>
+      </w:r>
+      <w:r>
+        <w:rPr>
+          <w:rFonts w:ascii="Consolas" w:cs="Consolas" w:eastAsia="Consolas" w:hAnsi="Consolas"/>
+          <w:color w:val="0E4A40"/>
+        </w:rPr>
+        <w:t xml:space="preserve">state[t]</w:t>
+      </w:r>
+      <w:r>
+        <w:t xml:space="preserve">), the timestamps were wall-clock receive time, the camera key differed per split, and there were no statistics; the first conversion also did not load in LeRobot. Details in §28.</w:t>
       </w:r>
     </w:p>
     <w:p>

</xml_diff>

<commit_message>
docs(sorting): seed 10 re-run, 40/40, datasets of 40 episodes
Seed 10 recorded again (record_tri_batch.sh 10 10): 4/4, the blue cube
nudged only 5 mm this time. The failed first run is set aside as
seed_010.first_run and never converted. Batch: 40/40, each on its
first attempt, ten episodes per instruction.

Datasets reconverted: LeRobot local/mycobot_tri_sort, 40 episodes,
7049 frames, 116 MB, reloaded by LeRobotDataset; RLDS mycobot_tri_sort
1.0.0, 40 episodes, 7056 steps, 190 MB, reloaded by tfds, no NaN.

record_tri_batch.sh counts seed_NNN folders only: its total said
"43 OK" by including the set-aside run. Report (EN/FR) and
specification updated with these numbers.
</commit_message>
<xml_diff>
--- a/Headless_Task-Grounded_Pick-and-Sort-and-Place_in_Gazebo/doc/FOUR_OBJECT_SORTING_REPORT.docx
+++ b/Headless_Task-Grounded_Pick-and-Sort-and-Place_in_Gazebo/doc/FOUR_OBJECT_SORTING_REPORT.docx
@@ -315,10 +315,10 @@
           <w:b/>
           <w:bCs/>
         </w:rPr>
-        <w:t xml:space="preserve">39/40 on the first attempt</w:t>
-      </w:r>
-      <w:r>
-        <w:t xml:space="preserve">.</w:t>
+        <w:t xml:space="preserve">40/40, each on its first attempt</w:t>
+      </w:r>
+      <w:r>
+        <w:t xml:space="preserve"> (seed 10 re-run once).</w:t>
       </w:r>
     </w:p>
     <w:p>
@@ -24630,7 +24630,7 @@
           <w:bCs/>
           <w:color w:val="0E4A40"/>
         </w:rPr>
-        <w:t xml:space="preserve">Result: 39/40 pick-and-places in their bin on the first attempt, 2026-10-10 15:15–18:21</w:t>
+        <w:t xml:space="preserve">Result: 40/40 pick-and-places in their bin, each on its first attempt (first pass 2026-10-10 15:15–18:21: 39/40; seed 10 re-run 19:09–19:27: 4/4)</w:t>
       </w:r>
     </w:p>
     <w:tbl>
@@ -25968,7 +25968,7 @@
                 <w:sz w:val="19"/>
                 <w:szCs w:val="19"/>
               </w:rPr>
-              <w:t xml:space="preserve">+5/-3</w:t>
+              <w:t xml:space="preserve">+8/-1</w:t>
             </w:r>
           </w:p>
         </w:tc>
@@ -26028,7 +26028,7 @@
                 <w:sz w:val="19"/>
                 <w:szCs w:val="19"/>
               </w:rPr>
-              <w:t xml:space="preserve">out of reach (§41)</w:t>
+              <w:t xml:space="preserve">-5/-3</w:t>
             </w:r>
           </w:p>
         </w:tc>
@@ -26048,7 +26048,7 @@
                 <w:sz w:val="19"/>
                 <w:szCs w:val="19"/>
               </w:rPr>
-              <w:t xml:space="preserve">15 min</w:t>
+              <w:t xml:space="preserve">18 min</w:t>
             </w:r>
           </w:p>
         </w:tc>
@@ -26064,7 +26064,7 @@
         <w:spacing w:after="100"/>
       </w:pPr>
       <w:r>
-        <w:t xml:space="preserve">Offsets from the bin centre in mm (dx/dy). Median 6.7 mm, maximum 17.3 (the bin opens at ±47 mm). Osama's campaign on the same seeds: 40/40, median 7 mm, max 17 mm. Per seed 15–20 (median 19) minutes; per episode 161–208 (median 174) frames per camera, 16.1–20.9 simulated seconds; bags 19.2 GB in the container.</w:t>
+        <w:t xml:space="preserve">Offsets from the bin centre in mm (dx/dy). Median 6.7 mm, maximum 17.3 (the bin opens at ±47 mm). Osama's campaign on the same seeds: 40/40, median 7 mm, max 17 mm. Per seed 18–20 (median 19) minutes; per episode 161–208 (median 174) frames per camera, 16.1–20.9 simulated seconds; bags 19.6 GB in the container.</w:t>
       </w:r>
     </w:p>
     <w:p>
@@ -26081,7 +26081,7 @@
           <w:b/>
           <w:bCs/>
         </w:rPr>
-        <w:t xml:space="preserve">The one failure: seed 10, blue cube.</w:t>
+        <w:t xml:space="preserve">First pass: one failure, seed 10, blue cube; the seed was re-run.</w:t>
       </w:r>
       <w:r>
         <w:t xml:space="preserve"> </w:t>
@@ -26094,7 +26094,27 @@
         <w:t xml:space="preserve">sim_sorting_grasp</w:t>
       </w:r>
       <w:r>
-        <w:t xml:space="preserve"> found no wrist orientation serving its three grasp heights, at (0.189, +0.216), 287 mm from the robot axis: beyond the vertical tool's reach. Seed 10 drew the cube at (0.190, +0.201), 277 mm; it had moved 15 mm during the three earlier picks of the seed (the yellow box, grasped just before, was 73 mm away; the recording does not show which move pushed it). The failure is in planning, before any motion; its episode is recorded with that verdict and excluded from conversion. Osama's run of seed 10 did not disturb it: contact physics is not deterministic. Re-running the seed (19 minutes) is the way to a 40th episode.</w:t>
+        <w:t xml:space="preserve"> found no wrist orientation serving its three grasp heights, at (0.189, +0.216), 287 mm from the robot axis: beyond the vertical tool's reach. Seed 10 drew the cube at (0.190, +0.201), 277 mm; it had moved 15 mm during the three earlier picks of the seed (the yellow box, grasped just before, was 73 mm away; the recording does not show which move pushed it). The failure is in planning, before any motion; its episode is recorded with that verdict and excluded from conversion. Osama's run of seed 10 did not disturb it: contact physics is not deterministic. The first run was moved aside (</w:t>
+      </w:r>
+      <w:r>
+        <w:rPr>
+          <w:rFonts w:ascii="Consolas" w:cs="Consolas" w:eastAsia="Consolas" w:hAnsi="Consolas"/>
+          <w:color w:val="0E4A40"/>
+        </w:rPr>
+        <w:t xml:space="preserve">seed_010.first_run</w:t>
+      </w:r>
+      <w:r>
+        <w:t xml:space="preserve">, never converted) and seed 10 recorded again with </w:t>
+      </w:r>
+      <w:r>
+        <w:rPr>
+          <w:rFonts w:ascii="Consolas" w:cs="Consolas" w:eastAsia="Consolas" w:hAnsi="Consolas"/>
+          <w:color w:val="0E4A40"/>
+        </w:rPr>
+        <w:t xml:space="preserve">record_tri_batch.sh 10 10</w:t>
+      </w:r>
+      <w:r>
+        <w:t xml:space="preserve">: 4/4, the blue cube nudged only 5 mm this time (picked at 0.189, +0.206) and dropped at −5/−3 mm. The table shows the re-run.</w:t>
       </w:r>
     </w:p>
     <w:p>
@@ -26102,7 +26122,17 @@
         <w:spacing w:after="100"/>
       </w:pPr>
       <w:r>
-        <w:t xml:space="preserve">Conversion of the 39 OK episodes (the failed one is excluded automatically): </w:t>
+        <w:t xml:space="preserve">Conversion of the 40 OK episodes (the failed first run of seed 10 is set aside as </w:t>
+      </w:r>
+      <w:r>
+        <w:rPr>
+          <w:rFonts w:ascii="Consolas" w:cs="Consolas" w:eastAsia="Consolas" w:hAnsi="Consolas"/>
+          <w:color w:val="0E4A40"/>
+        </w:rPr>
+        <w:t xml:space="preserve">seed_010.first_run</w:t>
+      </w:r>
+      <w:r>
+        <w:t xml:space="preserve"> and never converted): </w:t>
       </w:r>
       <w:r>
         <w:rPr>
@@ -26182,14 +26212,24 @@
         <w:t xml:space="preserve">rlds_builder</w:t>
       </w:r>
       <w:r>
-        <w:t xml:space="preserve">. </w:t>
+        <w:t xml:space="preserve">. LeRobot </w:t>
+      </w:r>
+      <w:r>
+        <w:rPr>
+          <w:rFonts w:ascii="Consolas" w:cs="Consolas" w:eastAsia="Consolas" w:hAnsi="Consolas"/>
+          <w:color w:val="0E4A40"/>
+        </w:rPr>
+        <w:t xml:space="preserve">local/mycobot_tri_sort</w:t>
+      </w:r>
+      <w:r>
+        <w:t xml:space="preserve">: </w:t>
       </w:r>
       <w:r>
         <w:rPr>
           <w:b/>
           <w:bCs/>
         </w:rPr>
-        <w:t xml:space="preserve">LeRobot `local/mycobot_tri_sort`: 39 episodes, 6 874 frames, 113 MB</w:t>
+        <w:t xml:space="preserve">40 episodes, 7 049 frames, 116 MB</w:t>
       </w:r>
       <w:r>
         <w:t xml:space="preserve">, reloaded by </w:t>
@@ -26202,14 +26242,34 @@
         <w:t xml:space="preserve">LeRobotDataset</w:t>
       </w:r>
       <w:r>
-        <w:t xml:space="preserve">: three 480×640 cameras, 161–208 frames per episode, a timestamp every 0.1 s, action ≠ state, 4 tasks (blue 9, red 10, green 10, yellow 10). </w:t>
+        <w:t xml:space="preserve">: three 480×640 cameras, 161–208 frames per episode, a timestamp every 0.1 s, action ≠ state, </w:t>
       </w:r>
       <w:r>
         <w:rPr>
           <w:b/>
           <w:bCs/>
         </w:rPr>
-        <w:t xml:space="preserve">RLDS `mycobot_tri_sort` 1.0.0: 39 episodes, 6 881 steps, 186 MB</w:t>
+        <w:t xml:space="preserve">10 episodes per instruction</w:t>
+      </w:r>
+      <w:r>
+        <w:t xml:space="preserve">. RLDS </w:t>
+      </w:r>
+      <w:r>
+        <w:rPr>
+          <w:rFonts w:ascii="Consolas" w:cs="Consolas" w:eastAsia="Consolas" w:hAnsi="Consolas"/>
+          <w:color w:val="0E4A40"/>
+        </w:rPr>
+        <w:t xml:space="preserve">mycobot_tri_sort</w:t>
+      </w:r>
+      <w:r>
+        <w:t xml:space="preserve"> 1.0.0: </w:t>
+      </w:r>
+      <w:r>
+        <w:rPr>
+          <w:b/>
+          <w:bCs/>
+        </w:rPr>
+        <w:t xml:space="preserve">40 episodes, 7 056 steps, 190 MB</w:t>
       </w:r>
       <w:r>
         <w:t xml:space="preserve">, reloaded by </w:t>
@@ -26222,7 +26282,7 @@
         <w:t xml:space="preserve">tfds</w:t>
       </w:r>
       <w:r>
-        <w:t xml:space="preserve">, no NaN, the same 4 instructions. The extraction first stopped on one episode whose three cameras did not share their last tick; it now keeps the stamps common to all three and reports the dropped edge frame (11 of 39 episodes lose one). The 7 frames between the two formats are rosetta's skipped first tick.</w:t>
+        <w:t xml:space="preserve">, no NaN, the same 4 × 10 instructions. The extraction first stopped on one episode whose three cameras did not share their last tick; it now keeps the stamps common to all three and reports the dropped edge frame. The 7 frames between the two formats are rosetta's skipped first tick.</w:t>
       </w:r>
     </w:p>
     <w:p>
@@ -27344,6 +27404,161 @@
           </w:p>
         </w:tc>
       </w:tr>
+      <w:tr>
+        <w:trPr>
+          <w:cantSplit/>
+        </w:trPr>
+        <w:tc>
+          <w:tcPr>
+            <w:tcW w:type="dxa" w:w="3200"/>
+            <w:tcMar>
+              <w:top w:type="dxa" w:w="80"/>
+              <w:left w:type="dxa" w:w="100"/>
+              <w:bottom w:type="dxa" w:w="80"/>
+              <w:right w:type="dxa" w:w="100"/>
+            </w:tcMar>
+          </w:tcPr>
+          <w:p>
+            <w:r>
+              <w:rPr>
+                <w:sz w:val="19"/>
+                <w:szCs w:val="19"/>
+              </w:rPr>
+              <w:t xml:space="preserve">RLDS extraction stops: "side frames without a top frame"</w:t>
+            </w:r>
+          </w:p>
+        </w:tc>
+        <w:tc>
+          <w:tcPr>
+            <w:tcW w:type="dxa" w:w="3400"/>
+            <w:tcMar>
+              <w:top w:type="dxa" w:w="80"/>
+              <w:left w:type="dxa" w:w="100"/>
+              <w:bottom w:type="dxa" w:w="80"/>
+              <w:right w:type="dxa" w:w="100"/>
+            </w:tcMar>
+          </w:tcPr>
+          <w:p>
+            <w:r>
+              <w:rPr>
+                <w:sz w:val="19"/>
+                <w:szCs w:val="19"/>
+              </w:rPr>
+              <w:t xml:space="preserve">a recording cut one camera's edge tick</w:t>
+            </w:r>
+          </w:p>
+        </w:tc>
+        <w:tc>
+          <w:tcPr>
+            <w:tcW w:type="dxa" w:w="2760"/>
+            <w:tcMar>
+              <w:top w:type="dxa" w:w="80"/>
+              <w:left w:type="dxa" w:w="100"/>
+              <w:bottom w:type="dxa" w:w="80"/>
+              <w:right w:type="dxa" w:w="100"/>
+            </w:tcMar>
+          </w:tcPr>
+          <w:p>
+            <w:r>
+              <w:rPr>
+                <w:sz w:val="19"/>
+                <w:szCs w:val="19"/>
+              </w:rPr>
+              <w:t xml:space="preserve">keep the stamps all three cameras share, §41</w:t>
+            </w:r>
+          </w:p>
+        </w:tc>
+      </w:tr>
+      <w:tr>
+        <w:trPr>
+          <w:cantSplit/>
+        </w:trPr>
+        <w:tc>
+          <w:tcPr>
+            <w:tcW w:type="dxa" w:w="3200"/>
+            <w:tcMar>
+              <w:top w:type="dxa" w:w="80"/>
+              <w:left w:type="dxa" w:w="100"/>
+              <w:bottom w:type="dxa" w:w="80"/>
+              <w:right w:type="dxa" w:w="100"/>
+            </w:tcMar>
+          </w:tcPr>
+          <w:p>
+            <w:r>
+              <w:rPr>
+                <w:sz w:val="19"/>
+                <w:szCs w:val="19"/>
+              </w:rPr>
+              <w:t xml:space="preserve">Batch total "43 OK" for 40 episodes</w:t>
+            </w:r>
+          </w:p>
+        </w:tc>
+        <w:tc>
+          <w:tcPr>
+            <w:tcW w:type="dxa" w:w="3400"/>
+            <w:tcMar>
+              <w:top w:type="dxa" w:w="80"/>
+              <w:left w:type="dxa" w:w="100"/>
+              <w:bottom w:type="dxa" w:w="80"/>
+              <w:right w:type="dxa" w:w="100"/>
+            </w:tcMar>
+          </w:tcPr>
+          <w:p>
+            <w:r>
+              <w:rPr>
+                <w:sz w:val="19"/>
+                <w:szCs w:val="19"/>
+              </w:rPr>
+              <w:t xml:space="preserve">the count also matched the set-aside </w:t>
+            </w:r>
+            <w:r>
+              <w:rPr>
+                <w:sz w:val="19"/>
+                <w:szCs w:val="19"/>
+                <w:rFonts w:ascii="Consolas" w:cs="Consolas" w:eastAsia="Consolas" w:hAnsi="Consolas"/>
+                <w:color w:val="0E4A40"/>
+              </w:rPr>
+              <w:t xml:space="preserve">seed_010.first_run</w:t>
+            </w:r>
+          </w:p>
+        </w:tc>
+        <w:tc>
+          <w:tcPr>
+            <w:tcW w:type="dxa" w:w="2760"/>
+            <w:tcMar>
+              <w:top w:type="dxa" w:w="80"/>
+              <w:left w:type="dxa" w:w="100"/>
+              <w:bottom w:type="dxa" w:w="80"/>
+              <w:right w:type="dxa" w:w="100"/>
+            </w:tcMar>
+          </w:tcPr>
+          <w:p>
+            <w:r>
+              <w:rPr>
+                <w:sz w:val="19"/>
+                <w:szCs w:val="19"/>
+              </w:rPr>
+              <w:t xml:space="preserve">count </w:t>
+            </w:r>
+            <w:r>
+              <w:rPr>
+                <w:sz w:val="19"/>
+                <w:szCs w:val="19"/>
+                <w:rFonts w:ascii="Consolas" w:cs="Consolas" w:eastAsia="Consolas" w:hAnsi="Consolas"/>
+                <w:color w:val="0E4A40"/>
+              </w:rPr>
+              <w:t xml:space="preserve">seed_NNN</w:t>
+            </w:r>
+            <w:r>
+              <w:rPr>
+                <w:sz w:val="19"/>
+                <w:szCs w:val="19"/>
+              </w:rPr>
+              <w:t xml:space="preserve"> folders only, §41</w:t>
+            </w:r>
+          </w:p>
+        </w:tc>
+      </w:tr>
     </w:tbl>
     <w:p>
       <w:pPr>
@@ -28798,7 +29013,7 @@
         <w:t xml:space="preserve">sim_grasp</w:t>
       </w:r>
       <w:r>
-        <w:t xml:space="preserve">): in this batch a cube nudged 15 mm by earlier picks ended out of reach (seed 10), where Osama's run of the same seed did not disturb it.</w:t>
+        <w:t xml:space="preserve">): in this batch a cube nudged 15 mm by earlier picks ended out of reach (seed 10, first run), where Osama's run and our re-run of the same seed did not push it that far. A batch must check every verdict and re-run, not assume.</w:t>
       </w:r>
     </w:p>
     <w:p>

</xml_diff>